<commit_message>
feat: dark glassmorphism theme for entire BackOffice (FrontOffice style)
- Rewrote styles.scss with full dark theme: transparent main-panel/content,
  glassmorphism cards (rgba blur), white text, dark tables, dark forms
- admin-layout.component.scss: content area transparent (photo shows through)
- WelcomeComponent: animated portal page with LinSoft logo + dark FrontOffice bg
- events-management, registrations, users, charges, notifications: dark styles
- Keycloak login theme: LinSoft branding (red button, dark background)
- Auth fixes: logout redirect to BackOffice port 4200
- Dashboard, FrontOffice, sidebar route /welcome, docker-compose updates
</commit_message>
<xml_diff>
--- a/Rapport_Fonctionnalites_EventManagement.docx
+++ b/Rapport_Fonctionnalites_EventManagement.docx
@@ -3806,6 +3806,2078 @@
         <w:t>Les hyperparamètres (seuils de coûts, multiplicateurs géographiques, poids du score santé) sont configurables sans recompilation</w:t>
       </w:r>
     </w:p>
+    <w:p>
+      <w:r>
+        <w:br w:type="page"/>
+      </w:r>
+    </w:p>
+    <w:p>
+      <w:pPr>
+        <w:pStyle w:val="Heading1"/>
+      </w:pPr>
+      <w:r>
+        <w:rPr>
+          <w:b/>
+          <w:color w:val="1F497D"/>
+        </w:rPr>
+        <w:t>5. Nouvelles Fonctionnalités — Session de Développement (Commit da72185)</w:t>
+      </w:r>
+    </w:p>
+    <w:p>
+      <w:r>
+        <w:rPr>
+          <w:sz w:val="22"/>
+        </w:rPr>
+        <w:t xml:space="preserve">Cette section documente les évolutions apportées lors de la dernière session de développement sur la branche </w:t>
+      </w:r>
+      <w:r>
+        <w:rPr>
+          <w:rFonts w:ascii="Courier New" w:hAnsi="Courier New"/>
+          <w:sz w:val="20"/>
+        </w:rPr>
+        <w:t>appmod/java-upgrade-20260211172141</w:t>
+      </w:r>
+      <w:r>
+        <w:rPr>
+          <w:sz w:val="22"/>
+        </w:rPr>
+        <w:t>. Le commit da72185 regroupe 55 fichiers modifiés ou créés, couvrant le FrontOffice React, le BackOffice Angular et plusieurs microservices backend.</w:t>
+      </w:r>
+    </w:p>
+    <w:p/>
+    <w:p>
+      <w:pPr>
+        <w:pStyle w:val="Heading2"/>
+      </w:pPr>
+      <w:r>
+        <w:rPr>
+          <w:b/>
+          <w:color w:val="2E75B6"/>
+        </w:rPr>
+        <w:t>5.1  Refonte Design du BackOffice (Style FrontOffice)</w:t>
+      </w:r>
+    </w:p>
+    <w:p>
+      <w:r>
+        <w:rPr>
+          <w:sz w:val="22"/>
+        </w:rPr>
+        <w:t>Le BackOffice Angular a subi une refonte visuelle complète pour adopter l'identité visuelle LinSoft déjà en place dans le FrontOffice React. Cette harmonisation garantit une cohérence visuelle entre les deux interfaces.</w:t>
+      </w:r>
+    </w:p>
+    <w:p>
+      <w:pPr>
+        <w:spacing w:before="160" w:after="80"/>
+      </w:pPr>
+      <w:r>
+        <w:rPr>
+          <w:b/>
+          <w:color w:val="1F497D"/>
+          <w:sz w:val="24"/>
+        </w:rPr>
+        <w:t>Améliorations visuelles</w:t>
+      </w:r>
+    </w:p>
+    <w:p>
+      <w:pPr>
+        <w:pStyle w:val="ListBullet"/>
+      </w:pPr>
+      <w:r>
+        <w:rPr>
+          <w:sz w:val="22"/>
+        </w:rPr>
+        <w:t>Adoption de la palette LinSoft : Navy #2A3652, Coral #FF5276, fond #f5f7fa</w:t>
+      </w:r>
+    </w:p>
+    <w:p>
+      <w:pPr>
+        <w:pStyle w:val="ListBullet"/>
+      </w:pPr>
+      <w:r>
+        <w:rPr>
+          <w:sz w:val="22"/>
+        </w:rPr>
+        <w:t>Liste des événements convertie en grille de cartes visuelles avec image de bannière, badge de date flottant et badge de statut coloré</w:t>
+      </w:r>
+    </w:p>
+    <w:p>
+      <w:pPr>
+        <w:pStyle w:val="ListBullet"/>
+      </w:pPr>
+      <w:r>
+        <w:rPr>
+          <w:sz w:val="22"/>
+        </w:rPr>
+        <w:t>Cartes avec border-radius 16px, box-shadow et effets hover</w:t>
+      </w:r>
+    </w:p>
+    <w:p>
+      <w:pPr>
+        <w:pStyle w:val="ListBullet"/>
+      </w:pPr>
+      <w:r>
+        <w:rPr>
+          <w:sz w:val="22"/>
+        </w:rPr>
+        <w:t>Fallback automatique vers Picsum Photos si aucune image n'est renseignée</w:t>
+      </w:r>
+    </w:p>
+    <w:p>
+      <w:pPr>
+        <w:pStyle w:val="ListBullet"/>
+      </w:pPr>
+      <w:r>
+        <w:rPr>
+          <w:sz w:val="22"/>
+        </w:rPr>
+        <w:t>Boutons d'action utilisant les icônes tim-icons (remplacement des nc-icons non chargées)</w:t>
+      </w:r>
+    </w:p>
+    <w:p>
+      <w:pPr>
+        <w:pStyle w:val="ListBullet"/>
+      </w:pPr>
+      <w:r>
+        <w:rPr>
+          <w:sz w:val="22"/>
+        </w:rPr>
+        <w:t>Correction des couleurs de texte (blanc sur fond sombre → contraste correct avec !important)</w:t>
+      </w:r>
+    </w:p>
+    <w:p>
+      <w:pPr>
+        <w:pStyle w:val="Heading2"/>
+      </w:pPr>
+      <w:r>
+        <w:rPr>
+          <w:b/>
+          <w:color w:val="2E75B6"/>
+        </w:rPr>
+        <w:t>5.2  Avatar de Profil Modifiable</w:t>
+      </w:r>
+    </w:p>
+    <w:p>
+      <w:r>
+        <w:rPr>
+          <w:sz w:val="22"/>
+        </w:rPr>
+        <w:t>Les utilisateurs peuvent désormais personnaliser leur photo de profil directement depuis la page Profil du FrontOffice.</w:t>
+      </w:r>
+    </w:p>
+    <w:p>
+      <w:pPr>
+        <w:spacing w:before="160" w:after="80"/>
+      </w:pPr>
+      <w:r>
+        <w:rPr>
+          <w:b/>
+          <w:color w:val="1F497D"/>
+          <w:sz w:val="24"/>
+        </w:rPr>
+        <w:t>Fonctionnement</w:t>
+      </w:r>
+    </w:p>
+    <w:p>
+      <w:pPr>
+        <w:pStyle w:val="ListBullet"/>
+      </w:pPr>
+      <w:r>
+        <w:rPr>
+          <w:sz w:val="22"/>
+        </w:rPr>
+        <w:t>Clic sur l'avatar → ouverture du sélecteur de fichier (JPG, PNG, WEBP — max 2 Mo)</w:t>
+      </w:r>
+    </w:p>
+    <w:p>
+      <w:pPr>
+        <w:pStyle w:val="ListBullet"/>
+      </w:pPr>
+      <w:r>
+        <w:rPr>
+          <w:sz w:val="22"/>
+        </w:rPr>
+        <w:t>Lecture du fichier en base64 via FileReader API</w:t>
+      </w:r>
+    </w:p>
+    <w:p>
+      <w:pPr>
+        <w:pStyle w:val="ListBullet"/>
+      </w:pPr>
+      <w:r>
+        <w:rPr>
+          <w:sz w:val="22"/>
+        </w:rPr>
+        <w:t>Prévisualisation instantanée avant sauvegarde</w:t>
+      </w:r>
+    </w:p>
+    <w:p>
+      <w:pPr>
+        <w:pStyle w:val="ListBullet"/>
+      </w:pPr>
+      <w:r>
+        <w:rPr>
+          <w:sz w:val="22"/>
+        </w:rPr>
+        <w:t>Persistance de l'avatar en localStorage lié à l'ID utilisateur (survit aux reconnexions)</w:t>
+      </w:r>
+    </w:p>
+    <w:p>
+      <w:pPr>
+        <w:pStyle w:val="ListBullet"/>
+      </w:pPr>
+      <w:r>
+        <w:rPr>
+          <w:sz w:val="22"/>
+        </w:rPr>
+        <w:t>Bouton de suppression de l'avatar avec retour à l'initiale</w:t>
+      </w:r>
+    </w:p>
+    <w:p>
+      <w:pPr>
+        <w:pStyle w:val="ListBullet"/>
+      </w:pPr>
+      <w:r>
+        <w:rPr>
+          <w:sz w:val="22"/>
+        </w:rPr>
+        <w:t>Synchronisation avec le contexte d'authentification (AuthContext)</w:t>
+      </w:r>
+    </w:p>
+    <w:p>
+      <w:pPr>
+        <w:pStyle w:val="Heading2"/>
+      </w:pPr>
+      <w:r>
+        <w:rPr>
+          <w:b/>
+          <w:color w:val="2E75B6"/>
+        </w:rPr>
+        <w:t>5.3  Traduction Française (FrontOffice + BackOffice)</w:t>
+      </w:r>
+    </w:p>
+    <w:p>
+      <w:r>
+        <w:rPr>
+          <w:sz w:val="22"/>
+        </w:rPr>
+        <w:t>L'ensemble de l'interface utilisateur a été traduit en français, tant côté FrontOffice que BackOffice.</w:t>
+      </w:r>
+    </w:p>
+    <w:p>
+      <w:pPr>
+        <w:spacing w:before="160" w:after="80"/>
+      </w:pPr>
+      <w:r>
+        <w:rPr>
+          <w:b/>
+          <w:color w:val="1F497D"/>
+          <w:sz w:val="24"/>
+        </w:rPr>
+        <w:t>FrontOffice (React)</w:t>
+      </w:r>
+    </w:p>
+    <w:p>
+      <w:pPr>
+        <w:pStyle w:val="ListBullet"/>
+      </w:pPr>
+      <w:r>
+        <w:rPr>
+          <w:sz w:val="22"/>
+        </w:rPr>
+        <w:t>Toutes les pages traduites : Accueil, Événements, Détail, Connexion, Inscription, Tableau de bord, Profil</w:t>
+      </w:r>
+    </w:p>
+    <w:p>
+      <w:pPr>
+        <w:pStyle w:val="ListBullet"/>
+      </w:pPr>
+      <w:r>
+        <w:rPr>
+          <w:sz w:val="22"/>
+        </w:rPr>
+        <w:t>Messages d'erreur, toasts, placeholders et labels de formulaires en français</w:t>
+      </w:r>
+    </w:p>
+    <w:p>
+      <w:pPr>
+        <w:pStyle w:val="ListBullet"/>
+      </w:pPr>
+      <w:r>
+        <w:rPr>
+          <w:sz w:val="22"/>
+        </w:rPr>
+        <w:t>Badges de statut traduits : Ouvert / À venir / Terminé / Annulé</w:t>
+      </w:r>
+    </w:p>
+    <w:p>
+      <w:pPr>
+        <w:pStyle w:val="ListBullet"/>
+      </w:pPr>
+      <w:r>
+        <w:rPr>
+          <w:sz w:val="22"/>
+        </w:rPr>
+        <w:t>Dates affichées au format français (JJ/MM/AAAA, noms de mois en français)</w:t>
+      </w:r>
+    </w:p>
+    <w:p>
+      <w:pPr>
+        <w:spacing w:before="160" w:after="80"/>
+      </w:pPr>
+      <w:r>
+        <w:rPr>
+          <w:b/>
+          <w:color w:val="1F497D"/>
+          <w:sz w:val="24"/>
+        </w:rPr>
+        <w:t>BackOffice (Angular)</w:t>
+      </w:r>
+    </w:p>
+    <w:p>
+      <w:pPr>
+        <w:pStyle w:val="ListBullet"/>
+      </w:pPr>
+      <w:r>
+        <w:rPr>
+          <w:sz w:val="22"/>
+        </w:rPr>
+        <w:t>Labels de la sidebar et des menus traduits en français</w:t>
+      </w:r>
+    </w:p>
+    <w:p>
+      <w:pPr>
+        <w:pStyle w:val="ListBullet"/>
+      </w:pPr>
+      <w:r>
+        <w:rPr>
+          <w:sz w:val="22"/>
+        </w:rPr>
+        <w:t>En-têtes de tableaux, titres de pages et messages d'état traduits</w:t>
+      </w:r>
+    </w:p>
+    <w:p>
+      <w:pPr>
+        <w:pStyle w:val="ListBullet"/>
+      </w:pPr>
+      <w:r>
+        <w:rPr>
+          <w:sz w:val="22"/>
+        </w:rPr>
+        <w:t>Messages de confirmation (suppression, approbation) en français</w:t>
+      </w:r>
+    </w:p>
+    <w:p>
+      <w:pPr>
+        <w:pStyle w:val="Heading2"/>
+      </w:pPr>
+      <w:r>
+        <w:rPr>
+          <w:b/>
+          <w:color w:val="2E75B6"/>
+        </w:rPr>
+        <w:t>5.4  Emails d'Inscription Automatiques</w:t>
+      </w:r>
+    </w:p>
+    <w:p>
+      <w:r>
+        <w:rPr>
+          <w:sz w:val="22"/>
+        </w:rPr>
+        <w:t>Le système de notifications envoie désormais des emails automatiques à deux types d'utilisateurs lors d'une inscription à un événement.</w:t>
+      </w:r>
+    </w:p>
+    <w:p>
+      <w:pPr>
+        <w:spacing w:before="160" w:after="80"/>
+      </w:pPr>
+      <w:r>
+        <w:rPr>
+          <w:b/>
+          <w:color w:val="1F497D"/>
+          <w:sz w:val="24"/>
+        </w:rPr>
+        <w:t>Email au participant connecté</w:t>
+      </w:r>
+    </w:p>
+    <w:p>
+      <w:pPr>
+        <w:pStyle w:val="ListBullet"/>
+      </w:pPr>
+      <w:r>
+        <w:rPr>
+          <w:sz w:val="22"/>
+        </w:rPr>
+        <w:t>Envoi automatique lors de la création d'une inscription (statut PENDING)</w:t>
+      </w:r>
+    </w:p>
+    <w:p>
+      <w:pPr>
+        <w:pStyle w:val="ListBullet"/>
+      </w:pPr>
+      <w:r>
+        <w:rPr>
+          <w:sz w:val="22"/>
+        </w:rPr>
+        <w:t>Contenu : confirmation d'inscription, nom de l'événement, date de début au format français</w:t>
+      </w:r>
+    </w:p>
+    <w:p>
+      <w:pPr>
+        <w:pStyle w:val="ListBullet"/>
+      </w:pPr>
+      <w:r>
+        <w:rPr>
+          <w:sz w:val="22"/>
+        </w:rPr>
+        <w:t>Mise à jour d'email lors du passage au statut CONFIRMED, CANCELLED ou WAITLISTED</w:t>
+      </w:r>
+    </w:p>
+    <w:p>
+      <w:pPr>
+        <w:pStyle w:val="ListBullet"/>
+      </w:pPr>
+      <w:r>
+        <w:rPr>
+          <w:sz w:val="22"/>
+        </w:rPr>
+        <w:t>Template HTML avec l'identité visuelle LinSoft</w:t>
+      </w:r>
+    </w:p>
+    <w:p>
+      <w:pPr>
+        <w:spacing w:before="160" w:after="80"/>
+      </w:pPr>
+      <w:r>
+        <w:rPr>
+          <w:b/>
+          <w:color w:val="1F497D"/>
+          <w:sz w:val="24"/>
+        </w:rPr>
+        <w:t>Email au visiteur non connecté (Guest Registration)</w:t>
+      </w:r>
+    </w:p>
+    <w:p>
+      <w:pPr>
+        <w:pStyle w:val="ListBullet"/>
+      </w:pPr>
+      <w:r>
+        <w:rPr>
+          <w:sz w:val="22"/>
+        </w:rPr>
+        <w:t>Modal GuestRegistrationModal permettant l'inscription sans compte Keycloak</w:t>
+      </w:r>
+    </w:p>
+    <w:p>
+      <w:pPr>
+        <w:pStyle w:val="ListBullet"/>
+      </w:pPr>
+      <w:r>
+        <w:rPr>
+          <w:sz w:val="22"/>
+        </w:rPr>
+        <w:t>Formulaire : prénom, nom, email, téléphone avec validation</w:t>
+      </w:r>
+    </w:p>
+    <w:p>
+      <w:pPr>
+        <w:pStyle w:val="ListBullet"/>
+      </w:pPr>
+      <w:r>
+        <w:rPr>
+          <w:sz w:val="22"/>
+        </w:rPr>
+        <w:t>Email de confirmation envoyé directement à l'adresse fournie</w:t>
+      </w:r>
+    </w:p>
+    <w:p>
+      <w:pPr>
+        <w:pStyle w:val="ListBullet"/>
+      </w:pPr>
+      <w:r>
+        <w:rPr>
+          <w:sz w:val="22"/>
+        </w:rPr>
+        <w:t>Validation côté client (format email, numéro de téléphone)</w:t>
+      </w:r>
+    </w:p>
+    <w:p>
+      <w:pPr>
+        <w:pStyle w:val="Heading2"/>
+      </w:pPr>
+      <w:r>
+        <w:rPr>
+          <w:b/>
+          <w:color w:val="2E75B6"/>
+        </w:rPr>
+        <w:t>5.5  Rappels Automatiques J-10 / J-5 / J-3 / J-2 / J-1 / Jour-J</w:t>
+      </w:r>
+    </w:p>
+    <w:p>
+      <w:r>
+        <w:rPr>
+          <w:sz w:val="22"/>
+        </w:rPr>
+        <w:t>Un système de rappels automatiques par email a été mis en place pour informer les participants inscrits à l'approche de la date d'un événement.</w:t>
+      </w:r>
+    </w:p>
+    <w:p>
+      <w:pPr>
+        <w:spacing w:before="160" w:after="80"/>
+      </w:pPr>
+      <w:r>
+        <w:rPr>
+          <w:b/>
+          <w:color w:val="1F497D"/>
+          <w:sz w:val="24"/>
+        </w:rPr>
+        <w:t>Calendrier des rappels</w:t>
+      </w:r>
+    </w:p>
+    <w:tbl>
+      <w:tblPr>
+        <w:tblStyle w:val="TableGrid"/>
+        <w:tblW w:type="auto" w:w="0"/>
+        <w:tblLook w:firstColumn="1" w:firstRow="1" w:lastColumn="0" w:lastRow="0" w:noHBand="0" w:noVBand="1" w:val="04A0"/>
+      </w:tblPr>
+      <w:tblGrid>
+        <w:gridCol w:w="3135"/>
+        <w:gridCol w:w="3135"/>
+        <w:gridCol w:w="3135"/>
+      </w:tblGrid>
+      <w:tr>
+        <w:tc>
+          <w:tcPr>
+            <w:tcW w:type="dxa" w:w="3135"/>
+            <w:shd w:val="clear" w:color="auto" w:fill="2E75B6"/>
+          </w:tcPr>
+          <w:p>
+            <w:r>
+              <w:rPr>
+                <w:b/>
+                <w:color w:val="FFFFFF"/>
+              </w:rPr>
+              <w:t>Délai</w:t>
+            </w:r>
+          </w:p>
+        </w:tc>
+        <w:tc>
+          <w:tcPr>
+            <w:tcW w:type="dxa" w:w="3135"/>
+            <w:shd w:val="clear" w:color="auto" w:fill="2E75B6"/>
+          </w:tcPr>
+          <w:p>
+            <w:r>
+              <w:rPr>
+                <w:b/>
+                <w:color w:val="FFFFFF"/>
+              </w:rPr>
+              <w:t>Déclenchement</w:t>
+            </w:r>
+          </w:p>
+        </w:tc>
+        <w:tc>
+          <w:tcPr>
+            <w:tcW w:type="dxa" w:w="3135"/>
+            <w:shd w:val="clear" w:color="auto" w:fill="2E75B6"/>
+          </w:tcPr>
+          <w:p>
+            <w:r>
+              <w:rPr>
+                <w:b/>
+                <w:color w:val="FFFFFF"/>
+              </w:rPr>
+              <w:t>Contenu</w:t>
+            </w:r>
+          </w:p>
+        </w:tc>
+      </w:tr>
+      <w:tr>
+        <w:tc>
+          <w:tcPr>
+            <w:tcW w:type="dxa" w:w="3135"/>
+          </w:tcPr>
+          <w:p>
+            <w:r>
+              <w:t>J-10</w:t>
+            </w:r>
+          </w:p>
+        </w:tc>
+        <w:tc>
+          <w:tcPr>
+            <w:tcW w:type="dxa" w:w="3135"/>
+          </w:tcPr>
+          <w:p>
+            <w:r>
+              <w:t>10 jours avant</w:t>
+            </w:r>
+          </w:p>
+        </w:tc>
+        <w:tc>
+          <w:tcPr>
+            <w:tcW w:type="dxa" w:w="3135"/>
+          </w:tcPr>
+          <w:p>
+            <w:r>
+              <w:t>Rappel préliminaire — confirmer sa participation</w:t>
+            </w:r>
+          </w:p>
+        </w:tc>
+      </w:tr>
+      <w:tr>
+        <w:tc>
+          <w:tcPr>
+            <w:tcW w:type="dxa" w:w="3135"/>
+          </w:tcPr>
+          <w:p>
+            <w:r>
+              <w:t>J-5</w:t>
+            </w:r>
+          </w:p>
+        </w:tc>
+        <w:tc>
+          <w:tcPr>
+            <w:tcW w:type="dxa" w:w="3135"/>
+          </w:tcPr>
+          <w:p>
+            <w:r>
+              <w:t>5 jours avant</w:t>
+            </w:r>
+          </w:p>
+        </w:tc>
+        <w:tc>
+          <w:tcPr>
+            <w:tcW w:type="dxa" w:w="3135"/>
+          </w:tcPr>
+          <w:p>
+            <w:r>
+              <w:t>Rappel intermédiaire — préparer sa venue</w:t>
+            </w:r>
+          </w:p>
+        </w:tc>
+      </w:tr>
+      <w:tr>
+        <w:tc>
+          <w:tcPr>
+            <w:tcW w:type="dxa" w:w="3135"/>
+          </w:tcPr>
+          <w:p>
+            <w:r>
+              <w:t>J-3</w:t>
+            </w:r>
+          </w:p>
+        </w:tc>
+        <w:tc>
+          <w:tcPr>
+            <w:tcW w:type="dxa" w:w="3135"/>
+          </w:tcPr>
+          <w:p>
+            <w:r>
+              <w:t>3 jours avant</w:t>
+            </w:r>
+          </w:p>
+        </w:tc>
+        <w:tc>
+          <w:tcPr>
+            <w:tcW w:type="dxa" w:w="3135"/>
+          </w:tcPr>
+          <w:p>
+            <w:r>
+              <w:t>Rappel rapproché — informations pratiques</w:t>
+            </w:r>
+          </w:p>
+        </w:tc>
+      </w:tr>
+      <w:tr>
+        <w:tc>
+          <w:tcPr>
+            <w:tcW w:type="dxa" w:w="3135"/>
+          </w:tcPr>
+          <w:p>
+            <w:r>
+              <w:t>J-2</w:t>
+            </w:r>
+          </w:p>
+        </w:tc>
+        <w:tc>
+          <w:tcPr>
+            <w:tcW w:type="dxa" w:w="3135"/>
+          </w:tcPr>
+          <w:p>
+            <w:r>
+              <w:t>2 jours avant</w:t>
+            </w:r>
+          </w:p>
+        </w:tc>
+        <w:tc>
+          <w:tcPr>
+            <w:tcW w:type="dxa" w:w="3135"/>
+          </w:tcPr>
+          <w:p>
+            <w:r>
+              <w:t>Rappel de dernière chance</w:t>
+            </w:r>
+          </w:p>
+        </w:tc>
+      </w:tr>
+      <w:tr>
+        <w:tc>
+          <w:tcPr>
+            <w:tcW w:type="dxa" w:w="3135"/>
+          </w:tcPr>
+          <w:p>
+            <w:r>
+              <w:t>J-1</w:t>
+            </w:r>
+          </w:p>
+        </w:tc>
+        <w:tc>
+          <w:tcPr>
+            <w:tcW w:type="dxa" w:w="3135"/>
+          </w:tcPr>
+          <w:p>
+            <w:r>
+              <w:t>La veille</w:t>
+            </w:r>
+          </w:p>
+        </w:tc>
+        <w:tc>
+          <w:tcPr>
+            <w:tcW w:type="dxa" w:w="3135"/>
+          </w:tcPr>
+          <w:p>
+            <w:r>
+              <w:t>Rappel final — détails de connexion / lieu</w:t>
+            </w:r>
+          </w:p>
+        </w:tc>
+      </w:tr>
+      <w:tr>
+        <w:tc>
+          <w:tcPr>
+            <w:tcW w:type="dxa" w:w="3135"/>
+          </w:tcPr>
+          <w:p>
+            <w:r>
+              <w:t>Jour-J</w:t>
+            </w:r>
+          </w:p>
+        </w:tc>
+        <w:tc>
+          <w:tcPr>
+            <w:tcW w:type="dxa" w:w="3135"/>
+          </w:tcPr>
+          <w:p>
+            <w:r>
+              <w:t>Le jour même</w:t>
+            </w:r>
+          </w:p>
+        </w:tc>
+        <w:tc>
+          <w:tcPr>
+            <w:tcW w:type="dxa" w:w="3135"/>
+          </w:tcPr>
+          <w:p>
+            <w:r>
+              <w:t>Message de bienvenue le matin de l'événement</w:t>
+            </w:r>
+          </w:p>
+        </w:tc>
+      </w:tr>
+    </w:tbl>
+    <w:p/>
+    <w:p>
+      <w:pPr>
+        <w:spacing w:before="160" w:after="80"/>
+      </w:pPr>
+      <w:r>
+        <w:rPr>
+          <w:b/>
+          <w:color w:val="1F497D"/>
+          <w:sz w:val="24"/>
+        </w:rPr>
+        <w:t>Implémentation technique</w:t>
+      </w:r>
+    </w:p>
+    <w:p>
+      <w:pPr>
+        <w:pStyle w:val="ListBullet"/>
+      </w:pPr>
+      <w:r>
+        <w:rPr>
+          <w:sz w:val="22"/>
+        </w:rPr>
+        <w:t>Service Quarkus avec scheduler (Quartz) pour le déclenchement périodique</w:t>
+      </w:r>
+    </w:p>
+    <w:p>
+      <w:pPr>
+        <w:pStyle w:val="ListBullet"/>
+      </w:pPr>
+      <w:r>
+        <w:rPr>
+          <w:sz w:val="22"/>
+        </w:rPr>
+        <w:t>Vérification quotidienne des événements dont la date correspond aux seuils J-10/J-5/J-3/J-2/J-1/J</w:t>
+      </w:r>
+    </w:p>
+    <w:p>
+      <w:pPr>
+        <w:pStyle w:val="ListBullet"/>
+      </w:pPr>
+      <w:r>
+        <w:rPr>
+          <w:sz w:val="22"/>
+        </w:rPr>
+        <w:t>Envoi via le notifications-service (canal email SMTP)</w:t>
+      </w:r>
+    </w:p>
+    <w:p>
+      <w:pPr>
+        <w:pStyle w:val="ListBullet"/>
+      </w:pPr>
+      <w:r>
+        <w:rPr>
+          <w:sz w:val="22"/>
+        </w:rPr>
+        <w:t>Envoi uniquement aux inscriptions au statut CONFIRMED</w:t>
+      </w:r>
+    </w:p>
+    <w:p>
+      <w:pPr>
+        <w:pStyle w:val="Heading2"/>
+      </w:pPr>
+      <w:r>
+        <w:rPr>
+          <w:b/>
+          <w:color w:val="2E75B6"/>
+        </w:rPr>
+        <w:t>5.6  Événements en Ligne avec Lien Google Meet Privé</w:t>
+      </w:r>
+    </w:p>
+    <w:p>
+      <w:r>
+        <w:rPr>
+          <w:sz w:val="22"/>
+        </w:rPr>
+        <w:t>Les organisateurs peuvent désormais créer des événements en ligne. Un lien Google Meet privé est généré automatiquement et envoyé par email uniquement aux participants inscrits et confirmés.</w:t>
+      </w:r>
+    </w:p>
+    <w:p>
+      <w:pPr>
+        <w:spacing w:before="160" w:after="80"/>
+      </w:pPr>
+      <w:r>
+        <w:rPr>
+          <w:b/>
+          <w:color w:val="1F497D"/>
+          <w:sz w:val="24"/>
+        </w:rPr>
+        <w:t>Création d'un événement en ligne</w:t>
+      </w:r>
+    </w:p>
+    <w:p>
+      <w:pPr>
+        <w:pStyle w:val="ListBullet"/>
+      </w:pPr>
+      <w:r>
+        <w:rPr>
+          <w:sz w:val="22"/>
+        </w:rPr>
+        <w:t>Champ isOnline (booléen) dans le modèle Event — coché à la création dans le BackOffice</w:t>
+      </w:r>
+    </w:p>
+    <w:p>
+      <w:pPr>
+        <w:pStyle w:val="ListBullet"/>
+      </w:pPr>
+      <w:r>
+        <w:rPr>
+          <w:sz w:val="22"/>
+        </w:rPr>
+        <w:t>Champ meetLink pour stocker l'URL Google Meet générée</w:t>
+      </w:r>
+    </w:p>
+    <w:p>
+      <w:pPr>
+        <w:pStyle w:val="ListBullet"/>
+      </w:pPr>
+      <w:r>
+        <w:rPr>
+          <w:sz w:val="22"/>
+        </w:rPr>
+        <w:t>Affichage dans le FrontOffice : badge "En ligne — le lien de connexion vous sera envoyé par email"</w:t>
+      </w:r>
+    </w:p>
+    <w:p>
+      <w:pPr>
+        <w:pStyle w:val="ListBullet"/>
+      </w:pPr>
+      <w:r>
+        <w:rPr>
+          <w:sz w:val="22"/>
+        </w:rPr>
+        <w:t>Le lien Meet n'est pas affiché publiquement sur la page événement</w:t>
+      </w:r>
+    </w:p>
+    <w:p>
+      <w:pPr>
+        <w:spacing w:before="160" w:after="80"/>
+      </w:pPr>
+      <w:r>
+        <w:rPr>
+          <w:b/>
+          <w:color w:val="1F497D"/>
+          <w:sz w:val="24"/>
+        </w:rPr>
+        <w:t>Envoi du lien Meet par email</w:t>
+      </w:r>
+    </w:p>
+    <w:p>
+      <w:pPr>
+        <w:pStyle w:val="ListBullet"/>
+      </w:pPr>
+      <w:r>
+        <w:rPr>
+          <w:sz w:val="22"/>
+        </w:rPr>
+        <w:t>Lien Google Meet envoyé uniquement lors du passage de l'inscription au statut CONFIRMED</w:t>
+      </w:r>
+    </w:p>
+    <w:p>
+      <w:pPr>
+        <w:pStyle w:val="ListBullet"/>
+      </w:pPr>
+      <w:r>
+        <w:rPr>
+          <w:sz w:val="22"/>
+        </w:rPr>
+        <w:t>Email dédié contenant le lien privé, la date, l'heure et les instructions de connexion</w:t>
+      </w:r>
+    </w:p>
+    <w:p>
+      <w:pPr>
+        <w:pStyle w:val="ListBullet"/>
+      </w:pPr>
+      <w:r>
+        <w:rPr>
+          <w:sz w:val="22"/>
+        </w:rPr>
+        <w:t>Le lien reste confidentiel — non accessible aux non-inscrits</w:t>
+      </w:r>
+    </w:p>
+    <w:p>
+      <w:pPr>
+        <w:pStyle w:val="ListBullet"/>
+      </w:pPr>
+      <w:r>
+        <w:rPr>
+          <w:sz w:val="22"/>
+        </w:rPr>
+        <w:t>Rappels J-1 et Jour-J incluent également le lien Meet dans leur contenu</w:t>
+      </w:r>
+    </w:p>
+    <w:p>
+      <w:pPr>
+        <w:pStyle w:val="Heading2"/>
+      </w:pPr>
+      <w:r>
+        <w:rPr>
+          <w:b/>
+          <w:color w:val="2E75B6"/>
+        </w:rPr>
+        <w:t>5.7  Corrections Techniques Majeures</w:t>
+      </w:r>
+    </w:p>
+    <w:p>
+      <w:r>
+        <w:rPr>
+          <w:sz w:val="22"/>
+        </w:rPr>
+        <w:t>La session a également permis de résoudre plusieurs bugs critiques affectant la cohérence des données et l'expérience utilisateur.</w:t>
+      </w:r>
+    </w:p>
+    <w:p>
+      <w:pPr>
+        <w:spacing w:before="160" w:after="80"/>
+      </w:pPr>
+      <w:r>
+        <w:rPr>
+          <w:b/>
+          <w:color w:val="1F497D"/>
+          <w:sz w:val="24"/>
+        </w:rPr>
+        <w:t>Correction du compteur de participants (12 Mai 2026)</w:t>
+      </w:r>
+    </w:p>
+    <w:p>
+      <w:pPr>
+        <w:pStyle w:val="ListBullet"/>
+      </w:pPr>
+      <w:r>
+        <w:rPr>
+          <w:sz w:val="22"/>
+        </w:rPr>
+        <w:t>Problème : currentParticipants restait bloqué à 0 après une inscription</w:t>
+      </w:r>
+    </w:p>
+    <w:p>
+      <w:pPr>
+        <w:pStyle w:val="ListBullet"/>
+      </w:pPr>
+      <w:r>
+        <w:rPr>
+          <w:sz w:val="22"/>
+        </w:rPr>
+        <w:t>Cause : aucun consommateur Kafka ne mettait à jour le champ dans l'events-service</w:t>
+      </w:r>
+    </w:p>
+    <w:p>
+      <w:pPr>
+        <w:pStyle w:val="ListBullet"/>
+      </w:pPr>
+      <w:r>
+        <w:rPr>
+          <w:sz w:val="22"/>
+        </w:rPr>
+        <w:t>Solution : ajout d'un RegistrationConsumer Kafka dans l'events-service écoutant registration.created (→ incrementParticipants) et registration.cancelled (→ decrementParticipants)</w:t>
+      </w:r>
+    </w:p>
+    <w:p>
+      <w:pPr>
+        <w:pStyle w:val="ListBullet"/>
+      </w:pPr>
+      <w:r>
+        <w:rPr>
+          <w:sz w:val="22"/>
+        </w:rPr>
+        <w:t>Correction rétroactive des données MongoDB existantes via script</w:t>
+      </w:r>
+    </w:p>
+    <w:p>
+      <w:pPr>
+        <w:spacing w:before="160" w:after="80"/>
+      </w:pPr>
+      <w:r>
+        <w:rPr>
+          <w:b/>
+          <w:color w:val="1F497D"/>
+          <w:sz w:val="24"/>
+        </w:rPr>
+        <w:t>Correction de l'affichage du nom du participant (12 Mai 2026)</w:t>
+      </w:r>
+    </w:p>
+    <w:p>
+      <w:pPr>
+        <w:pStyle w:val="ListBullet"/>
+      </w:pPr>
+      <w:r>
+        <w:rPr>
+          <w:sz w:val="22"/>
+        </w:rPr>
+        <w:t>Problème : colonne Participant affichait l'UUID Keycloak au lieu du nom complet</w:t>
+      </w:r>
+    </w:p>
+    <w:p>
+      <w:pPr>
+        <w:pStyle w:val="ListBullet"/>
+      </w:pPr>
+      <w:r>
+        <w:rPr>
+          <w:sz w:val="22"/>
+        </w:rPr>
+        <w:t>Cause : participantId stocké = UUID Keycloak ≠ ObjectId MongoDB utilisé pour le matching</w:t>
+      </w:r>
+    </w:p>
+    <w:p>
+      <w:pPr>
+        <w:pStyle w:val="ListBullet"/>
+      </w:pPr>
+      <w:r>
+        <w:rPr>
+          <w:sz w:val="22"/>
+        </w:rPr>
+        <w:t>Solution : double correspondance u.id === participantId || u.keycloakId === participantId</w:t>
+      </w:r>
+    </w:p>
+    <w:p>
+      <w:pPr>
+        <w:spacing w:before="160" w:after="80"/>
+      </w:pPr>
+      <w:r>
+        <w:rPr>
+          <w:b/>
+          <w:color w:val="1F497D"/>
+          <w:sz w:val="24"/>
+        </w:rPr>
+        <w:t>Correction du routage Gateway Docker (6 Mai 2026)</w:t>
+      </w:r>
+    </w:p>
+    <w:p>
+      <w:pPr>
+        <w:pStyle w:val="ListBullet"/>
+      </w:pPr>
+      <w:r>
+        <w:rPr>
+          <w:sz w:val="22"/>
+        </w:rPr>
+        <w:t>Problème : erreurs CORS 503 — routes gateway lb://service-name non résolues (services Quarkus non enregistrés dans Eureka)</w:t>
+      </w:r>
+    </w:p>
+    <w:p>
+      <w:pPr>
+        <w:pStyle w:val="ListBullet"/>
+      </w:pPr>
+      <w:r>
+        <w:rPr>
+          <w:sz w:val="22"/>
+        </w:rPr>
+        <w:t>Solution : remplacement des URI lb:// par URLs Docker DNS directes (http://service-name:port)</w:t>
+      </w:r>
+    </w:p>
+    <w:p>
+      <w:pPr>
+        <w:pStyle w:val="ListBullet"/>
+      </w:pPr>
+      <w:r>
+        <w:rPr>
+          <w:sz w:val="22"/>
+        </w:rPr>
+        <w:t>Toutes les routes retournent désormais 200 OK via le gateway</w:t>
+      </w:r>
+    </w:p>
+    <w:p>
+      <w:pPr>
+        <w:spacing w:before="160" w:after="80"/>
+      </w:pPr>
+      <w:r>
+        <w:rPr>
+          <w:b/>
+          <w:color w:val="1F497D"/>
+          <w:sz w:val="24"/>
+        </w:rPr>
+        <w:t>Synchronisation des alias de champs Event (6 Mai 2026)</w:t>
+      </w:r>
+    </w:p>
+    <w:p>
+      <w:pPr>
+        <w:pStyle w:val="ListBullet"/>
+      </w:pPr>
+      <w:r>
+        <w:rPr>
+          <w:sz w:val="22"/>
+        </w:rPr>
+        <w:t>Problème : champs name/title et startDate/startAt stockés sans synchronisation → dates nulles</w:t>
+      </w:r>
+    </w:p>
+    <w:p>
+      <w:pPr>
+        <w:pStyle w:val="ListBullet"/>
+      </w:pPr>
+      <w:r>
+        <w:rPr>
+          <w:sz w:val="22"/>
+        </w:rPr>
+        <w:t>Solution : méthode create() de EventService synchronise les alias avant persistance</w:t>
+      </w:r>
+    </w:p>
+    <w:p>
+      <w:pPr>
+        <w:pStyle w:val="ListBullet"/>
+      </w:pPr>
+      <w:r>
+        <w:rPr>
+          <w:sz w:val="22"/>
+        </w:rPr>
+        <w:t>Limite de taille de requête HTTP portée à 10 Mo pour les images base64</w:t>
+      </w:r>
+    </w:p>
+    <w:p>
+      <w:pPr>
+        <w:spacing w:before="160" w:after="80"/>
+      </w:pPr>
+      <w:r>
+        <w:rPr>
+          <w:b/>
+          <w:color w:val="1F497D"/>
+          <w:sz w:val="24"/>
+        </w:rPr>
+        <w:t>FrontOffice — Corrections fonctionnelles (11 Mai 2026)</w:t>
+      </w:r>
+    </w:p>
+    <w:p>
+      <w:pPr>
+        <w:pStyle w:val="ListBullet"/>
+      </w:pPr>
+      <w:r>
+        <w:rPr>
+          <w:sz w:val="22"/>
+        </w:rPr>
+        <w:t>Proxy Vite corrigé : chaque service a sa propre règle de routage</w:t>
+      </w:r>
+    </w:p>
+    <w:p>
+      <w:pPr>
+        <w:pStyle w:val="ListBullet"/>
+      </w:pPr>
+      <w:r>
+        <w:rPr>
+          <w:sz w:val="22"/>
+        </w:rPr>
+        <w:t>Champ userId → participantId aligné entre FrontOffice et backend</w:t>
+      </w:r>
+    </w:p>
+    <w:p>
+      <w:pPr>
+        <w:pStyle w:val="ListBullet"/>
+      </w:pPr>
+      <w:r>
+        <w:rPr>
+          <w:sz w:val="22"/>
+        </w:rPr>
+        <w:t>Filtres par catégorie corrigés (CONFERENCE/WORKSHOP/MEETUP/SEMINAR alignés avec le backend)</w:t>
+      </w:r>
+    </w:p>
+    <w:p>
+      <w:pPr>
+        <w:pStyle w:val="ListBullet"/>
+      </w:pPr>
+      <w:r>
+        <w:rPr>
+          <w:sz w:val="22"/>
+        </w:rPr>
+        <w:t>Dashboard utilisateur : filtre inscriptions corrigé (r.participantId === auth.user.id)</w:t>
+      </w:r>
+    </w:p>
+    <w:p>
+      <w:pPr>
+        <w:pStyle w:val="Heading2"/>
+      </w:pPr>
+      <w:r>
+        <w:rPr>
+          <w:b/>
+          <w:color w:val="2E75B6"/>
+        </w:rPr>
+        <w:t>5.8  FrontOffice React — Interface Participant</w:t>
+      </w:r>
+    </w:p>
+    <w:p>
+      <w:r>
+        <w:rPr>
+          <w:sz w:val="22"/>
+        </w:rPr>
+        <w:t>Le FrontOffice React a été créé de zéro (44 fichiers, +10 399 lignes) pour offrir une interface dédiée aux participants de la plateforme.</w:t>
+      </w:r>
+    </w:p>
+    <w:p>
+      <w:pPr>
+        <w:spacing w:before="160" w:after="80"/>
+      </w:pPr>
+      <w:r>
+        <w:rPr>
+          <w:b/>
+          <w:color w:val="1F497D"/>
+          <w:sz w:val="24"/>
+        </w:rPr>
+        <w:t>Pages disponibles</w:t>
+      </w:r>
+    </w:p>
+    <w:tbl>
+      <w:tblPr>
+        <w:tblStyle w:val="TableGrid"/>
+        <w:tblW w:type="auto" w:w="0"/>
+        <w:tblLook w:firstColumn="1" w:firstRow="1" w:lastColumn="0" w:lastRow="0" w:noHBand="0" w:noVBand="1" w:val="04A0"/>
+      </w:tblPr>
+      <w:tblGrid>
+        <w:gridCol w:w="3135"/>
+        <w:gridCol w:w="3135"/>
+        <w:gridCol w:w="3135"/>
+      </w:tblGrid>
+      <w:tr>
+        <w:tc>
+          <w:tcPr>
+            <w:tcW w:type="dxa" w:w="3135"/>
+            <w:shd w:val="clear" w:color="auto" w:fill="2E75B6"/>
+          </w:tcPr>
+          <w:p>
+            <w:r>
+              <w:rPr>
+                <w:b/>
+                <w:color w:val="FFFFFF"/>
+              </w:rPr>
+              <w:t>Page</w:t>
+            </w:r>
+          </w:p>
+        </w:tc>
+        <w:tc>
+          <w:tcPr>
+            <w:tcW w:type="dxa" w:w="3135"/>
+            <w:shd w:val="clear" w:color="auto" w:fill="2E75B6"/>
+          </w:tcPr>
+          <w:p>
+            <w:r>
+              <w:rPr>
+                <w:b/>
+                <w:color w:val="FFFFFF"/>
+              </w:rPr>
+              <w:t>Accès</w:t>
+            </w:r>
+          </w:p>
+        </w:tc>
+        <w:tc>
+          <w:tcPr>
+            <w:tcW w:type="dxa" w:w="3135"/>
+            <w:shd w:val="clear" w:color="auto" w:fill="2E75B6"/>
+          </w:tcPr>
+          <w:p>
+            <w:r>
+              <w:rPr>
+                <w:b/>
+                <w:color w:val="FFFFFF"/>
+              </w:rPr>
+              <w:t>Fonctionnalités</w:t>
+            </w:r>
+          </w:p>
+        </w:tc>
+      </w:tr>
+      <w:tr>
+        <w:tc>
+          <w:tcPr>
+            <w:tcW w:type="dxa" w:w="3135"/>
+          </w:tcPr>
+          <w:p>
+            <w:r>
+              <w:t>Accueil (/)</w:t>
+            </w:r>
+          </w:p>
+        </w:tc>
+        <w:tc>
+          <w:tcPr>
+            <w:tcW w:type="dxa" w:w="3135"/>
+          </w:tcPr>
+          <w:p>
+            <w:r>
+              <w:t>Public</w:t>
+            </w:r>
+          </w:p>
+        </w:tc>
+        <w:tc>
+          <w:tcPr>
+            <w:tcW w:type="dxa" w:w="3135"/>
+          </w:tcPr>
+          <w:p>
+            <w:r>
+              <w:t>Hero LinSoft, recherche globale, catégories, événements vedettes</w:t>
+            </w:r>
+          </w:p>
+        </w:tc>
+      </w:tr>
+      <w:tr>
+        <w:tc>
+          <w:tcPr>
+            <w:tcW w:type="dxa" w:w="3135"/>
+          </w:tcPr>
+          <w:p>
+            <w:r>
+              <w:t>Événements (/events)</w:t>
+            </w:r>
+          </w:p>
+        </w:tc>
+        <w:tc>
+          <w:tcPr>
+            <w:tcW w:type="dxa" w:w="3135"/>
+          </w:tcPr>
+          <w:p>
+            <w:r>
+              <w:t>Public</w:t>
+            </w:r>
+          </w:p>
+        </w:tc>
+        <w:tc>
+          <w:tcPr>
+            <w:tcW w:type="dxa" w:w="3135"/>
+          </w:tcPr>
+          <w:p>
+            <w:r>
+              <w:t>Liste filtrée par catégorie et statut, tri, compteur résultats</w:t>
+            </w:r>
+          </w:p>
+        </w:tc>
+      </w:tr>
+      <w:tr>
+        <w:tc>
+          <w:tcPr>
+            <w:tcW w:type="dxa" w:w="3135"/>
+          </w:tcPr>
+          <w:p>
+            <w:r>
+              <w:t>Détail (/events/:id)</w:t>
+            </w:r>
+          </w:p>
+        </w:tc>
+        <w:tc>
+          <w:tcPr>
+            <w:tcW w:type="dxa" w:w="3135"/>
+          </w:tcPr>
+          <w:p>
+            <w:r>
+              <w:t>Public</w:t>
+            </w:r>
+          </w:p>
+        </w:tc>
+        <w:tc>
+          <w:tcPr>
+            <w:tcW w:type="dxa" w:w="3135"/>
+          </w:tcPr>
+          <w:p>
+            <w:r>
+              <w:t>Bannière photo, méta-données, boutons contextuels, inscription visiteur</w:t>
+            </w:r>
+          </w:p>
+        </w:tc>
+      </w:tr>
+      <w:tr>
+        <w:tc>
+          <w:tcPr>
+            <w:tcW w:type="dxa" w:w="3135"/>
+          </w:tcPr>
+          <w:p>
+            <w:r>
+              <w:t>Connexion (/login)</w:t>
+            </w:r>
+          </w:p>
+        </w:tc>
+        <w:tc>
+          <w:tcPr>
+            <w:tcW w:type="dxa" w:w="3135"/>
+          </w:tcPr>
+          <w:p>
+            <w:r>
+              <w:t>Public</w:t>
+            </w:r>
+          </w:p>
+        </w:tc>
+        <w:tc>
+          <w:tcPr>
+            <w:tcW w:type="dxa" w:w="3135"/>
+          </w:tcPr>
+          <w:p>
+            <w:r>
+              <w:t>Formulaire JWT/Keycloak avec validation</w:t>
+            </w:r>
+          </w:p>
+        </w:tc>
+      </w:tr>
+      <w:tr>
+        <w:tc>
+          <w:tcPr>
+            <w:tcW w:type="dxa" w:w="3135"/>
+          </w:tcPr>
+          <w:p>
+            <w:r>
+              <w:t>Inscription (/register)</w:t>
+            </w:r>
+          </w:p>
+        </w:tc>
+        <w:tc>
+          <w:tcPr>
+            <w:tcW w:type="dxa" w:w="3135"/>
+          </w:tcPr>
+          <w:p>
+            <w:r>
+              <w:t>Public</w:t>
+            </w:r>
+          </w:p>
+        </w:tc>
+        <w:tc>
+          <w:tcPr>
+            <w:tcW w:type="dxa" w:w="3135"/>
+          </w:tcPr>
+          <w:p>
+            <w:r>
+              <w:t>OAuth social (Google, GitHub, LinkedIn) + formulaire email</w:t>
+            </w:r>
+          </w:p>
+        </w:tc>
+      </w:tr>
+      <w:tr>
+        <w:tc>
+          <w:tcPr>
+            <w:tcW w:type="dxa" w:w="3135"/>
+          </w:tcPr>
+          <w:p>
+            <w:r>
+              <w:t>Tableau de bord (/dashboard)</w:t>
+            </w:r>
+          </w:p>
+        </w:tc>
+        <w:tc>
+          <w:tcPr>
+            <w:tcW w:type="dxa" w:w="3135"/>
+          </w:tcPr>
+          <w:p>
+            <w:r>
+              <w:t>Protégé</w:t>
+            </w:r>
+          </w:p>
+        </w:tc>
+        <w:tc>
+          <w:tcPr>
+            <w:tcW w:type="dxa" w:w="3135"/>
+          </w:tcPr>
+          <w:p>
+            <w:r>
+              <w:t>Statistiques personnelles, liste inscriptions filtrée</w:t>
+            </w:r>
+          </w:p>
+        </w:tc>
+      </w:tr>
+      <w:tr>
+        <w:tc>
+          <w:tcPr>
+            <w:tcW w:type="dxa" w:w="3135"/>
+          </w:tcPr>
+          <w:p>
+            <w:r>
+              <w:t>Profil (/profile)</w:t>
+            </w:r>
+          </w:p>
+        </w:tc>
+        <w:tc>
+          <w:tcPr>
+            <w:tcW w:type="dxa" w:w="3135"/>
+          </w:tcPr>
+          <w:p>
+            <w:r>
+              <w:t>Protégé</w:t>
+            </w:r>
+          </w:p>
+        </w:tc>
+        <w:tc>
+          <w:tcPr>
+            <w:tcW w:type="dxa" w:w="3135"/>
+          </w:tcPr>
+          <w:p>
+            <w:r>
+              <w:t>Modification prénom/nom/téléphone, avatar modifiable</w:t>
+            </w:r>
+          </w:p>
+        </w:tc>
+      </w:tr>
+    </w:tbl>
+    <w:p/>
+    <w:p>
+      <w:pPr>
+        <w:spacing w:before="160" w:after="80"/>
+      </w:pPr>
+      <w:r>
+        <w:rPr>
+          <w:b/>
+          <w:color w:val="1F497D"/>
+          <w:sz w:val="24"/>
+        </w:rPr>
+        <w:t>Authentification et sécurité</w:t>
+      </w:r>
+    </w:p>
+    <w:p>
+      <w:pPr>
+        <w:pStyle w:val="ListBullet"/>
+      </w:pPr>
+      <w:r>
+        <w:rPr>
+          <w:sz w:val="22"/>
+        </w:rPr>
+        <w:t>AuthContext + hook useAuth() : gestion du JWT via Keycloak</w:t>
+      </w:r>
+    </w:p>
+    <w:p>
+      <w:pPr>
+        <w:pStyle w:val="ListBullet"/>
+      </w:pPr>
+      <w:r>
+        <w:rPr>
+          <w:sz w:val="22"/>
+        </w:rPr>
+        <w:t>Intercepteur Axios : token Bearer automatique + auto-logout sur 401</w:t>
+      </w:r>
+    </w:p>
+    <w:p>
+      <w:pPr>
+        <w:pStyle w:val="ListBullet"/>
+      </w:pPr>
+      <w:r>
+        <w:rPr>
+          <w:sz w:val="22"/>
+        </w:rPr>
+        <w:t>ProtectedRoute : redirection vers /login si non authentifié</w:t>
+      </w:r>
+    </w:p>
+    <w:p>
+      <w:pPr>
+        <w:pStyle w:val="ListBullet"/>
+      </w:pPr>
+      <w:r>
+        <w:rPr>
+          <w:sz w:val="22"/>
+        </w:rPr>
+        <w:t>OAuth social : Google, GitHub, LinkedIn via Keycloak IdP</w:t>
+      </w:r>
+    </w:p>
+    <w:p>
+      <w:pPr>
+        <w:pStyle w:val="Heading2"/>
+      </w:pPr>
+      <w:r>
+        <w:rPr>
+          <w:b/>
+          <w:color w:val="2E75B6"/>
+        </w:rPr>
+        <w:t>5.9  Récapitulatif du Commit da72185</w:t>
+      </w:r>
+    </w:p>
+    <w:tbl>
+      <w:tblPr>
+        <w:tblStyle w:val="TableGrid"/>
+        <w:tblW w:type="auto" w:w="0"/>
+        <w:tblLook w:firstColumn="1" w:firstRow="1" w:lastColumn="0" w:lastRow="0" w:noHBand="0" w:noVBand="1" w:val="04A0"/>
+      </w:tblPr>
+      <w:tblGrid>
+        <w:gridCol w:w="3135"/>
+        <w:gridCol w:w="3135"/>
+        <w:gridCol w:w="3135"/>
+      </w:tblGrid>
+      <w:tr>
+        <w:tc>
+          <w:tcPr>
+            <w:tcW w:type="dxa" w:w="3135"/>
+            <w:shd w:val="clear" w:color="auto" w:fill="2E75B6"/>
+          </w:tcPr>
+          <w:p>
+            <w:r>
+              <w:rPr>
+                <w:b/>
+                <w:color w:val="FFFFFF"/>
+              </w:rPr>
+              <w:t>Fonctionnalité</w:t>
+            </w:r>
+          </w:p>
+        </w:tc>
+        <w:tc>
+          <w:tcPr>
+            <w:tcW w:type="dxa" w:w="3135"/>
+            <w:shd w:val="clear" w:color="auto" w:fill="2E75B6"/>
+          </w:tcPr>
+          <w:p>
+            <w:r>
+              <w:rPr>
+                <w:b/>
+                <w:color w:val="FFFFFF"/>
+              </w:rPr>
+              <w:t>Périmètre</w:t>
+            </w:r>
+          </w:p>
+        </w:tc>
+        <w:tc>
+          <w:tcPr>
+            <w:tcW w:type="dxa" w:w="3135"/>
+            <w:shd w:val="clear" w:color="auto" w:fill="2E75B6"/>
+          </w:tcPr>
+          <w:p>
+            <w:r>
+              <w:rPr>
+                <w:b/>
+                <w:color w:val="FFFFFF"/>
+              </w:rPr>
+              <w:t>Statut</w:t>
+            </w:r>
+          </w:p>
+        </w:tc>
+      </w:tr>
+      <w:tr>
+        <w:tc>
+          <w:tcPr>
+            <w:tcW w:type="dxa" w:w="3135"/>
+          </w:tcPr>
+          <w:p>
+            <w:r>
+              <w:t>Refonte design BackOffice</w:t>
+            </w:r>
+          </w:p>
+        </w:tc>
+        <w:tc>
+          <w:tcPr>
+            <w:tcW w:type="dxa" w:w="3135"/>
+          </w:tcPr>
+          <w:p>
+            <w:r>
+              <w:t>BackOffice Angular</w:t>
+            </w:r>
+          </w:p>
+        </w:tc>
+        <w:tc>
+          <w:tcPr>
+            <w:tcW w:type="dxa" w:w="3135"/>
+          </w:tcPr>
+          <w:p>
+            <w:r>
+              <w:t>Terminé ✅</w:t>
+            </w:r>
+          </w:p>
+        </w:tc>
+      </w:tr>
+      <w:tr>
+        <w:tc>
+          <w:tcPr>
+            <w:tcW w:type="dxa" w:w="3135"/>
+          </w:tcPr>
+          <w:p>
+            <w:r>
+              <w:t>Avatar de profil modifiable</w:t>
+            </w:r>
+          </w:p>
+        </w:tc>
+        <w:tc>
+          <w:tcPr>
+            <w:tcW w:type="dxa" w:w="3135"/>
+          </w:tcPr>
+          <w:p>
+            <w:r>
+              <w:t>FrontOffice React</w:t>
+            </w:r>
+          </w:p>
+        </w:tc>
+        <w:tc>
+          <w:tcPr>
+            <w:tcW w:type="dxa" w:w="3135"/>
+          </w:tcPr>
+          <w:p>
+            <w:r>
+              <w:t>Terminé ✅</w:t>
+            </w:r>
+          </w:p>
+        </w:tc>
+      </w:tr>
+      <w:tr>
+        <w:tc>
+          <w:tcPr>
+            <w:tcW w:type="dxa" w:w="3135"/>
+          </w:tcPr>
+          <w:p>
+            <w:r>
+              <w:t>Traduction française complète</w:t>
+            </w:r>
+          </w:p>
+        </w:tc>
+        <w:tc>
+          <w:tcPr>
+            <w:tcW w:type="dxa" w:w="3135"/>
+          </w:tcPr>
+          <w:p>
+            <w:r>
+              <w:t>FrontOffice + BackOffice</w:t>
+            </w:r>
+          </w:p>
+        </w:tc>
+        <w:tc>
+          <w:tcPr>
+            <w:tcW w:type="dxa" w:w="3135"/>
+          </w:tcPr>
+          <w:p>
+            <w:r>
+              <w:t>Terminé ✅</w:t>
+            </w:r>
+          </w:p>
+        </w:tc>
+      </w:tr>
+      <w:tr>
+        <w:tc>
+          <w:tcPr>
+            <w:tcW w:type="dxa" w:w="3135"/>
+          </w:tcPr>
+          <w:p>
+            <w:r>
+              <w:t>Emails d'inscription (participant + visiteur)</w:t>
+            </w:r>
+          </w:p>
+        </w:tc>
+        <w:tc>
+          <w:tcPr>
+            <w:tcW w:type="dxa" w:w="3135"/>
+          </w:tcPr>
+          <w:p>
+            <w:r>
+              <w:t>notifications-service</w:t>
+            </w:r>
+          </w:p>
+        </w:tc>
+        <w:tc>
+          <w:tcPr>
+            <w:tcW w:type="dxa" w:w="3135"/>
+          </w:tcPr>
+          <w:p>
+            <w:r>
+              <w:t>Terminé ✅</w:t>
+            </w:r>
+          </w:p>
+        </w:tc>
+      </w:tr>
+      <w:tr>
+        <w:tc>
+          <w:tcPr>
+            <w:tcW w:type="dxa" w:w="3135"/>
+          </w:tcPr>
+          <w:p>
+            <w:r>
+              <w:t>Rappels automatiques J-10/J-5/J-3/J-2/J-1/Jour-J</w:t>
+            </w:r>
+          </w:p>
+        </w:tc>
+        <w:tc>
+          <w:tcPr>
+            <w:tcW w:type="dxa" w:w="3135"/>
+          </w:tcPr>
+          <w:p>
+            <w:r>
+              <w:t>notifications-service</w:t>
+            </w:r>
+          </w:p>
+        </w:tc>
+        <w:tc>
+          <w:tcPr>
+            <w:tcW w:type="dxa" w:w="3135"/>
+          </w:tcPr>
+          <w:p>
+            <w:r>
+              <w:t>Terminé ✅</w:t>
+            </w:r>
+          </w:p>
+        </w:tc>
+      </w:tr>
+      <w:tr>
+        <w:tc>
+          <w:tcPr>
+            <w:tcW w:type="dxa" w:w="3135"/>
+          </w:tcPr>
+          <w:p>
+            <w:r>
+              <w:t>Événements en ligne + lien Google Meet privé</w:t>
+            </w:r>
+          </w:p>
+        </w:tc>
+        <w:tc>
+          <w:tcPr>
+            <w:tcW w:type="dxa" w:w="3135"/>
+          </w:tcPr>
+          <w:p>
+            <w:r>
+              <w:t>events-service + FrontOffice</w:t>
+            </w:r>
+          </w:p>
+        </w:tc>
+        <w:tc>
+          <w:tcPr>
+            <w:tcW w:type="dxa" w:w="3135"/>
+          </w:tcPr>
+          <w:p>
+            <w:r>
+              <w:t>Terminé ✅</w:t>
+            </w:r>
+          </w:p>
+        </w:tc>
+      </w:tr>
+      <w:tr>
+        <w:tc>
+          <w:tcPr>
+            <w:tcW w:type="dxa" w:w="3135"/>
+          </w:tcPr>
+          <w:p>
+            <w:r>
+              <w:t>Compteur participants via Kafka</w:t>
+            </w:r>
+          </w:p>
+        </w:tc>
+        <w:tc>
+          <w:tcPr>
+            <w:tcW w:type="dxa" w:w="3135"/>
+          </w:tcPr>
+          <w:p>
+            <w:r>
+              <w:t>events-service</w:t>
+            </w:r>
+          </w:p>
+        </w:tc>
+        <w:tc>
+          <w:tcPr>
+            <w:tcW w:type="dxa" w:w="3135"/>
+          </w:tcPr>
+          <w:p>
+            <w:r>
+              <w:t>Terminé ✅</w:t>
+            </w:r>
+          </w:p>
+        </w:tc>
+      </w:tr>
+      <w:tr>
+        <w:tc>
+          <w:tcPr>
+            <w:tcW w:type="dxa" w:w="3135"/>
+          </w:tcPr>
+          <w:p>
+            <w:r>
+              <w:t>Correction nom participant (UUID → nom)</w:t>
+            </w:r>
+          </w:p>
+        </w:tc>
+        <w:tc>
+          <w:tcPr>
+            <w:tcW w:type="dxa" w:w="3135"/>
+          </w:tcPr>
+          <w:p>
+            <w:r>
+              <w:t>BackOffice</w:t>
+            </w:r>
+          </w:p>
+        </w:tc>
+        <w:tc>
+          <w:tcPr>
+            <w:tcW w:type="dxa" w:w="3135"/>
+          </w:tcPr>
+          <w:p>
+            <w:r>
+              <w:t>Terminé ✅</w:t>
+            </w:r>
+          </w:p>
+        </w:tc>
+      </w:tr>
+      <w:tr>
+        <w:tc>
+          <w:tcPr>
+            <w:tcW w:type="dxa" w:w="3135"/>
+          </w:tcPr>
+          <w:p>
+            <w:r>
+              <w:t>Correction routage Gateway Docker</w:t>
+            </w:r>
+          </w:p>
+        </w:tc>
+        <w:tc>
+          <w:tcPr>
+            <w:tcW w:type="dxa" w:w="3135"/>
+          </w:tcPr>
+          <w:p>
+            <w:r>
+              <w:t>docker-compose.yml</w:t>
+            </w:r>
+          </w:p>
+        </w:tc>
+        <w:tc>
+          <w:tcPr>
+            <w:tcW w:type="dxa" w:w="3135"/>
+          </w:tcPr>
+          <w:p>
+            <w:r>
+              <w:t>Terminé ✅</w:t>
+            </w:r>
+          </w:p>
+        </w:tc>
+      </w:tr>
+      <w:tr>
+        <w:tc>
+          <w:tcPr>
+            <w:tcW w:type="dxa" w:w="3135"/>
+          </w:tcPr>
+          <w:p>
+            <w:r>
+              <w:t>Correction proxy Vite FrontOffice</w:t>
+            </w:r>
+          </w:p>
+        </w:tc>
+        <w:tc>
+          <w:tcPr>
+            <w:tcW w:type="dxa" w:w="3135"/>
+          </w:tcPr>
+          <w:p>
+            <w:r>
+              <w:t>FrontOffice</w:t>
+            </w:r>
+          </w:p>
+        </w:tc>
+        <w:tc>
+          <w:tcPr>
+            <w:tcW w:type="dxa" w:w="3135"/>
+          </w:tcPr>
+          <w:p>
+            <w:r>
+              <w:t>Terminé ✅</w:t>
+            </w:r>
+          </w:p>
+        </w:tc>
+      </w:tr>
+      <w:tr>
+        <w:tc>
+          <w:tcPr>
+            <w:tcW w:type="dxa" w:w="3135"/>
+          </w:tcPr>
+          <w:p>
+            <w:r>
+              <w:t>Études IA Python (3 modèles)</w:t>
+            </w:r>
+          </w:p>
+        </w:tc>
+        <w:tc>
+          <w:tcPr>
+            <w:tcW w:type="dxa" w:w="3135"/>
+          </w:tcPr>
+          <w:p>
+            <w:r>
+              <w:t>ia-studies/</w:t>
+            </w:r>
+          </w:p>
+        </w:tc>
+        <w:tc>
+          <w:tcPr>
+            <w:tcW w:type="dxa" w:w="3135"/>
+          </w:tcPr>
+          <w:p>
+            <w:r>
+              <w:t>Terminé ✅</w:t>
+            </w:r>
+          </w:p>
+        </w:tc>
+      </w:tr>
+      <w:tr>
+        <w:tc>
+          <w:tcPr>
+            <w:tcW w:type="dxa" w:w="3135"/>
+          </w:tcPr>
+          <w:p>
+            <w:r>
+              <w:t>Inscription visiteur sans compte</w:t>
+            </w:r>
+          </w:p>
+        </w:tc>
+        <w:tc>
+          <w:tcPr>
+            <w:tcW w:type="dxa" w:w="3135"/>
+          </w:tcPr>
+          <w:p>
+            <w:r>
+              <w:t>FrontOffice + registrations-service</w:t>
+            </w:r>
+          </w:p>
+        </w:tc>
+        <w:tc>
+          <w:tcPr>
+            <w:tcW w:type="dxa" w:w="3135"/>
+          </w:tcPr>
+          <w:p>
+            <w:r>
+              <w:t>Terminé ✅</w:t>
+            </w:r>
+          </w:p>
+        </w:tc>
+      </w:tr>
+    </w:tbl>
+    <w:p/>
     <w:sectPr>
       <w:pgSz w:w="12240" w:h="15840"/>
       <w:pgMar w:top="1417" w:right="1417" w:bottom="1417" w:left="1417" w:header="720" w:footer="720" w:gutter="0"/>

</xml_diff>